<commit_message>
Expand Tier 3 gene list to 129 comprehensive cancer-associated genes
TIER3_GENES: 129 genes across 4 categories:
- Chromatin/epigenetic (30): KMT2D, CREBBP, EZH2, ARID1A/B, SMARCA4,
  DNMT3A, TET2, IDH1/2, SETD2, KDM6A, KMT2C, ASXL1/2, BCOR, etc.
- DNA repair/cell cycle (35): TP53, ATM/ATR, BRCA1/2, PALB2, MSH2/6,
  MLH1, PMS2, CDK4/6, MYC, BCL2, PTEN, etc.
- RTK/signaling (40): EGFR, ERBB2/3, FGFR1-3, KIT, MET, FLT3,
  JAK1-3, KRAS/NRAS/BRAF, PI3K/AKT/mTOR, BTK, MYD88, XPO1, etc.
- Splicing (24): SF3B1, SRSF2, DDX3X, DDX41, U2AF1/2, ZRSR2, etc.

ACTIONABLE_TIER3_GENES: expanded to 75 genes with FDA-approved or
clinical trial drug targets + key prognostic markers. GUI "View list"
button shows the full actionable gene inventory.

Co-Authored-By: Claude Opus 4.6 <noreply@anthropic.com>
</commit_message>
<xml_diff>
--- a/0224/04-PHJ_10680696/04-PHJ_10680696_clinical_report.docx
+++ b/0224/04-PHJ_10680696/04-PHJ_10680696_clinical_report.docx
@@ -4288,6 +4288,342 @@
                 <w:sz w:val="18"/>
               </w:rPr>
               <w:t>18.24%</w:t>
+            </w:r>
+          </w:p>
+        </w:tc>
+        <w:tc>
+          <w:tcPr>
+            <w:tcW w:w="2214" w:type="dxa"/>
+            <w:tcBorders>
+              <w:top w:val="double" w:sz="4" w:space="0" w:color="auto"/>
+              <w:bottom w:val="double" w:sz="4" w:space="0" w:color="auto"/>
+            </w:tcBorders>
+            <w:vAlign w:val="center"/>
+          </w:tcPr>
+          <w:p>
+            <w:pPr>
+              <w:jc w:val="center"/>
+              <w:cnfStyle w:val="000000100000" w:firstRow="0" w:lastRow="0" w:firstColumn="0" w:lastColumn="0" w:oddVBand="0" w:evenVBand="0" w:oddHBand="1" w:evenHBand="0" w:firstRowFirstColumn="0" w:firstRowLastColumn="0" w:lastRowFirstColumn="0" w:lastRowLastColumn="0"/>
+              <w:rPr>
+                <w:b/>
+                <w:sz w:val="16"/>
+              </w:rPr>
+            </w:pPr>
+            <w:r>
+              <w:rPr>
+                <w:b/>
+                <w:sz w:val="16"/>
+              </w:rPr>
+            </w:r>
+            <w:proofErr w:type="spellStart"/>
+            <w:r>
+              <w:rPr>
+                <w:b/>
+                <w:sz w:val="16"/>
+              </w:rPr>
+            </w:r>
+            <w:proofErr w:type="spellEnd"/>
+            <w:r>
+              <w:rPr>
+                <w:rFonts w:ascii="Malgun Gothic" w:hAnsi="Malgun Gothic"/>
+                <w:b w:val="0"/>
+                <w:sz w:val="18"/>
+              </w:rPr>
+            </w:r>
+          </w:p>
+          <w:p>
+            <w:pPr>
+              <w:jc w:val="center"/>
+              <w:cnfStyle w:val="000000100000" w:firstRow="0" w:lastRow="0" w:firstColumn="0" w:lastColumn="0" w:oddVBand="0" w:evenVBand="0" w:oddHBand="1" w:evenHBand="0" w:firstRowFirstColumn="0" w:firstRowLastColumn="0" w:lastRowFirstColumn="0" w:lastRowLastColumn="0"/>
+              <w:rPr>
+                <w:rFonts w:ascii="Arial Narrow" w:hAnsi="Arial Narrow" w:cs="Calibri"/>
+                <w:b/>
+                <w:sz w:val="16"/>
+              </w:rPr>
+            </w:pPr>
+            <w:r>
+              <w:rPr>
+                <w:b/>
+                <w:sz w:val="14"/>
+              </w:rPr>
+            </w:r>
+            <w:proofErr w:type="spellStart"/>
+            <w:r>
+              <w:rPr>
+                <w:b/>
+                <w:sz w:val="14"/>
+              </w:rPr>
+            </w:r>
+            <w:proofErr w:type="spellEnd"/>
+            <w:r>
+              <w:rPr>
+                <w:b/>
+                <w:sz w:val="14"/>
+              </w:rPr>
+            </w:r>
+          </w:p>
+        </w:tc>
+      </w:tr>
+      <w:tr>
+        <w:trPr>
+          <w:cnfStyle w:val="000000100000" w:firstRow="0" w:lastRow="0" w:firstColumn="0" w:lastColumn="0" w:oddVBand="0" w:evenVBand="0" w:oddHBand="1" w:evenHBand="0" w:firstRowFirstColumn="0" w:firstRowLastColumn="0" w:lastRowFirstColumn="0" w:lastRowLastColumn="0"/>
+          <w:trHeight w:hRule="exact" w:val="624"/>
+        </w:trPr>
+        <w:tc>
+          <w:tcPr>
+            <w:cnfStyle w:val="001000000000" w:firstRow="0" w:lastRow="0" w:firstColumn="1" w:lastColumn="0" w:oddVBand="0" w:evenVBand="0" w:oddHBand="0" w:evenHBand="0" w:firstRowFirstColumn="0" w:firstRowLastColumn="0" w:lastRowFirstColumn="0" w:lastRowLastColumn="0"/>
+            <w:tcW w:w="1276" w:type="dxa"/>
+            <w:tcBorders>
+              <w:top w:val="double" w:sz="4" w:space="0" w:color="auto"/>
+              <w:bottom w:val="double" w:sz="4" w:space="0" w:color="auto"/>
+            </w:tcBorders>
+            <w:vAlign w:val="center"/>
+          </w:tcPr>
+          <w:p>
+            <w:pPr>
+              <w:spacing w:after="160" w:line="259" w:lineRule="auto"/>
+              <w:jc w:val="center"/>
+              <w:rPr>
+                <w:sz w:val="16"/>
+              </w:rPr>
+            </w:pPr>
+            <w:r>
+              <w:rPr>
+                <w:caps w:val="0"/>
+                <w:sz w:val="16"/>
+              </w:rPr>
+            </w:r>
+            <w:r>
+              <w:rPr>
+                <w:rFonts w:ascii="Malgun Gothic" w:hAnsi="Malgun Gothic"/>
+                <w:b w:val="0"/>
+                <w:sz w:val="18"/>
+              </w:rPr>
+              <w:t>Tier 3</w:t>
+            </w:r>
+          </w:p>
+        </w:tc>
+        <w:tc>
+          <w:tcPr>
+            <w:tcW w:w="1134" w:type="dxa"/>
+            <w:tcBorders>
+              <w:top w:val="double" w:sz="4" w:space="0" w:color="auto"/>
+              <w:bottom w:val="double" w:sz="4" w:space="0" w:color="auto"/>
+            </w:tcBorders>
+            <w:vAlign w:val="center"/>
+          </w:tcPr>
+          <w:p>
+            <w:pPr>
+              <w:jc w:val="center"/>
+              <w:cnfStyle w:val="000000100000" w:firstRow="0" w:lastRow="0" w:firstColumn="0" w:lastColumn="0" w:oddVBand="0" w:evenVBand="0" w:oddHBand="1" w:evenHBand="0" w:firstRowFirstColumn="0" w:firstRowLastColumn="0" w:lastRowFirstColumn="0" w:lastRowLastColumn="0"/>
+              <w:rPr>
+                <w:rFonts w:ascii="Arial Narrow" w:hAnsi="Arial Narrow" w:cs="Calibri"/>
+                <w:b/>
+                <w:sz w:val="16"/>
+              </w:rPr>
+            </w:pPr>
+            <w:r>
+              <w:rPr>
+                <w:b/>
+                <w:sz w:val="16"/>
+              </w:rPr>
+            </w:r>
+            <w:r>
+              <w:rPr>
+                <w:rFonts w:ascii="Malgun Gothic" w:hAnsi="Malgun Gothic"/>
+                <w:b w:val="0"/>
+                <w:sz w:val="18"/>
+              </w:rPr>
+              <w:t>KMT2D</w:t>
+            </w:r>
+          </w:p>
+        </w:tc>
+        <w:tc>
+          <w:tcPr>
+            <w:tcW w:w="1134" w:type="dxa"/>
+            <w:tcBorders>
+              <w:top w:val="double" w:sz="4" w:space="0" w:color="auto"/>
+              <w:bottom w:val="double" w:sz="4" w:space="0" w:color="auto"/>
+            </w:tcBorders>
+            <w:vAlign w:val="center"/>
+          </w:tcPr>
+          <w:p>
+            <w:pPr>
+              <w:jc w:val="center"/>
+              <w:cnfStyle w:val="000000100000" w:firstRow="0" w:lastRow="0" w:firstColumn="0" w:lastColumn="0" w:oddVBand="0" w:evenVBand="0" w:oddHBand="1" w:evenHBand="0" w:firstRowFirstColumn="0" w:firstRowLastColumn="0" w:lastRowFirstColumn="0" w:lastRowLastColumn="0"/>
+              <w:rPr>
+                <w:b/>
+                <w:sz w:val="16"/>
+              </w:rPr>
+            </w:pPr>
+            <w:r>
+              <w:rPr>
+                <w:b/>
+                <w:sz w:val="16"/>
+              </w:rPr>
+            </w:r>
+            <w:r>
+              <w:rPr>
+                <w:rFonts w:ascii="Malgun Gothic" w:hAnsi="Malgun Gothic"/>
+                <w:b w:val="0"/>
+                <w:sz w:val="18"/>
+              </w:rPr>
+              <w:t>ENST00000301067.7</w:t>
+            </w:r>
+          </w:p>
+          <w:p>
+            <w:pPr>
+              <w:jc w:val="center"/>
+              <w:cnfStyle w:val="000000100000" w:firstRow="0" w:lastRow="0" w:firstColumn="0" w:lastColumn="0" w:oddVBand="0" w:evenVBand="0" w:oddHBand="1" w:evenHBand="0" w:firstRowFirstColumn="0" w:firstRowLastColumn="0" w:lastRowFirstColumn="0" w:lastRowLastColumn="0"/>
+              <w:rPr>
+                <w:rFonts w:ascii="Arial Narrow" w:hAnsi="Arial Narrow" w:cs="Calibri"/>
+                <w:b/>
+                <w:sz w:val="16"/>
+              </w:rPr>
+            </w:pPr>
+            <w:r>
+              <w:rPr>
+                <w:b/>
+                <w:sz w:val="16"/>
+              </w:rPr>
+            </w:r>
+          </w:p>
+        </w:tc>
+        <w:tc>
+          <w:tcPr>
+            <w:tcW w:w="1418" w:type="dxa"/>
+            <w:tcBorders>
+              <w:top w:val="double" w:sz="4" w:space="0" w:color="auto"/>
+              <w:bottom w:val="double" w:sz="4" w:space="0" w:color="auto"/>
+            </w:tcBorders>
+            <w:vAlign w:val="center"/>
+          </w:tcPr>
+          <w:p>
+            <w:pPr>
+              <w:jc w:val="center"/>
+              <w:cnfStyle w:val="000000100000" w:firstRow="0" w:lastRow="0" w:firstColumn="0" w:lastColumn="0" w:oddVBand="0" w:evenVBand="0" w:oddHBand="1" w:evenHBand="0" w:firstRowFirstColumn="0" w:firstRowLastColumn="0" w:lastRowFirstColumn="0" w:lastRowLastColumn="0"/>
+              <w:rPr>
+                <w:rFonts w:ascii="Arial Narrow" w:hAnsi="Arial Narrow" w:cs="Calibri"/>
+                <w:b/>
+                <w:sz w:val="16"/>
+              </w:rPr>
+            </w:pPr>
+            <w:r>
+              <w:rPr>
+                <w:b/>
+                <w:sz w:val="16"/>
+              </w:rPr>
+            </w:r>
+            <w:r>
+              <w:rPr>
+                <w:rFonts w:ascii="Malgun Gothic" w:hAnsi="Malgun Gothic"/>
+                <w:b w:val="0"/>
+                <w:sz w:val="18"/>
+              </w:rPr>
+            </w:r>
+          </w:p>
+        </w:tc>
+        <w:tc>
+          <w:tcPr>
+            <w:tcW w:w="1275" w:type="dxa"/>
+            <w:tcBorders>
+              <w:top w:val="double" w:sz="4" w:space="0" w:color="auto"/>
+              <w:bottom w:val="double" w:sz="4" w:space="0" w:color="auto"/>
+            </w:tcBorders>
+            <w:vAlign w:val="center"/>
+          </w:tcPr>
+          <w:p>
+            <w:pPr>
+              <w:spacing w:after="160" w:line="259" w:lineRule="auto"/>
+              <w:jc w:val="center"/>
+              <w:cnfStyle w:val="000000100000" w:firstRow="0" w:lastRow="0" w:firstColumn="0" w:lastColumn="0" w:oddVBand="0" w:evenVBand="0" w:oddHBand="1" w:evenHBand="0" w:firstRowFirstColumn="0" w:firstRowLastColumn="0" w:lastRowFirstColumn="0" w:lastRowLastColumn="0"/>
+              <w:rPr>
+                <w:b/>
+                <w:sz w:val="16"/>
+              </w:rPr>
+            </w:pPr>
+            <w:r>
+              <w:rPr>
+                <w:b/>
+                <w:sz w:val="16"/>
+              </w:rPr>
+            </w:r>
+            <w:r>
+              <w:rPr>
+                <w:rFonts w:ascii="Malgun Gothic" w:hAnsi="Malgun Gothic"/>
+                <w:b w:val="0"/>
+                <w:sz w:val="18"/>
+              </w:rPr>
+              <w:t>c.10356-9G&gt;A</w:t>
+            </w:r>
+          </w:p>
+        </w:tc>
+        <w:tc>
+          <w:tcPr>
+            <w:tcW w:w="1276" w:type="dxa"/>
+            <w:tcBorders>
+              <w:top w:val="double" w:sz="4" w:space="0" w:color="auto"/>
+              <w:bottom w:val="double" w:sz="4" w:space="0" w:color="auto"/>
+            </w:tcBorders>
+            <w:vAlign w:val="center"/>
+          </w:tcPr>
+          <w:p>
+            <w:pPr>
+              <w:jc w:val="center"/>
+              <w:cnfStyle w:val="000000100000" w:firstRow="0" w:lastRow="0" w:firstColumn="0" w:lastColumn="0" w:oddVBand="0" w:evenVBand="0" w:oddHBand="1" w:evenHBand="0" w:firstRowFirstColumn="0" w:firstRowLastColumn="0" w:lastRowFirstColumn="0" w:lastRowLastColumn="0"/>
+              <w:rPr>
+                <w:rFonts w:ascii="Arial Narrow" w:hAnsi="Arial Narrow" w:cs="Calibri"/>
+                <w:b/>
+                <w:sz w:val="16"/>
+              </w:rPr>
+            </w:pPr>
+            <w:r>
+              <w:rPr>
+                <w:b/>
+                <w:sz w:val="16"/>
+              </w:rPr>
+            </w:r>
+            <w:r>
+              <w:rPr>
+                <w:rFonts w:ascii="Malgun Gothic" w:hAnsi="Malgun Gothic"/>
+                <w:b w:val="0"/>
+                <w:sz w:val="18"/>
+              </w:rPr>
+            </w:r>
+          </w:p>
+        </w:tc>
+        <w:tc>
+          <w:tcPr>
+            <w:tcW w:w="709" w:type="dxa"/>
+            <w:tcBorders>
+              <w:top w:val="double" w:sz="4" w:space="0" w:color="auto"/>
+              <w:bottom w:val="double" w:sz="4" w:space="0" w:color="auto"/>
+            </w:tcBorders>
+            <w:vAlign w:val="center"/>
+          </w:tcPr>
+          <w:p>
+            <w:pPr>
+              <w:jc w:val="center"/>
+              <w:cnfStyle w:val="000000100000" w:firstRow="0" w:lastRow="0" w:firstColumn="0" w:lastColumn="0" w:oddVBand="0" w:evenVBand="0" w:oddHBand="1" w:evenHBand="0" w:firstRowFirstColumn="0" w:firstRowLastColumn="0" w:lastRowFirstColumn="0" w:lastRowLastColumn="0"/>
+              <w:rPr>
+                <w:rFonts w:ascii="Arial Narrow" w:hAnsi="Arial Narrow" w:cs="Calibri"/>
+                <w:b/>
+                <w:sz w:val="16"/>
+              </w:rPr>
+            </w:pPr>
+            <w:r>
+              <w:rPr>
+                <w:b/>
+                <w:sz w:val="16"/>
+              </w:rPr>
+            </w:r>
+            <w:r>
+              <w:rPr>
+                <w:rFonts w:ascii="Malgun Gothic" w:hAnsi="Malgun Gothic"/>
+                <w:b w:val="0"/>
+                <w:sz w:val="18"/>
+              </w:rPr>
+              <w:t>15.06%</w:t>
             </w:r>
           </w:p>
         </w:tc>

</xml_diff>